<commit_message>
rename project from PinaNet to TEGER (Transposable Elements Genomic Entity Recognition)
Update all references across README, Python scripts, and Word documentation.

Co-Authored-By: Claude Sonnet 4.6 <noreply@anthropic.com>
</commit_message>
<xml_diff>
--- a/docs/installation_manual.docx
+++ b/docs/installation_manual.docx
@@ -16,7 +16,7 @@
           <w:sz w:val="72"/>
           <w:szCs w:val="72"/>
         </w:rPr>
-        <w:t xml:space="preserve">PinaNet</w:t>
+        <w:t xml:space="preserve">TEGER</w:t>
       </w:r>
     </w:p>
     <w:p>
@@ -101,7 +101,7 @@
           <w:sz w:val="22"/>
           <w:szCs w:val="22"/>
         </w:rPr>
-        <w:t xml:space="preserve">This document describes the complete installation process for PinaNet, a deep learning-based tool for the automatic detection and annotation of Transposable Elements (TEs) in raw genomic FASTA sequences. PinaNet relies on a hybrid neural architecture combining DNABERT-2 and BiLSTM networks and is designed to run on NVIDIA GPU-equipped servers running Linux.</w:t>
+        <w:t xml:space="preserve">This document describes the complete installation process for TEGER, a deep learning-based tool for the automatic detection and annotation of Transposable Elements (TEs) in raw genomic FASTA sequences. TEGER relies on a hybrid neural architecture combining DNABERT-2 and BiLSTM networks and is designed to run on NVIDIA GPU-equipped servers running Linux.</w:t>
       </w:r>
     </w:p>
     <w:p>
@@ -1226,7 +1226,7 @@
           <w:sz w:val="22"/>
           <w:szCs w:val="22"/>
         </w:rPr>
-        <w:t xml:space="preserve">Open a terminal and run the following commands to clone the PinaNet repository into your working directory:</w:t>
+        <w:t xml:space="preserve">Open a terminal and run the following commands to clone the TEGER repository into your working directory:</w:t>
       </w:r>
     </w:p>
     <w:p>
@@ -1242,7 +1242,7 @@
           <w:sz w:val="18"/>
           <w:szCs w:val="18"/>
         </w:rPr>
-        <w:t xml:space="preserve">git clone https://github.com/johanpina/PinaNet.git</w:t>
+        <w:t xml:space="preserve">git clone https://github.com/johanpina/TEGER.git</w:t>
       </w:r>
     </w:p>
     <w:p>
@@ -1258,7 +1258,7 @@
           <w:sz w:val="18"/>
           <w:szCs w:val="18"/>
         </w:rPr>
-        <w:t xml:space="preserve">cd PinaNet</w:t>
+        <w:t xml:space="preserve">cd TEGER</w:t>
       </w:r>
     </w:p>
     <w:p>
@@ -1293,7 +1293,7 @@
           <w:sz w:val="22"/>
           <w:szCs w:val="22"/>
         </w:rPr>
-        <w:t xml:space="preserve">Create a dedicated Anaconda environment to isolate PinaNet's dependencies from other projects on the same server. Python 3.9 is recommended for compatibility with all dependencies.</w:t>
+        <w:t xml:space="preserve">Create a dedicated Anaconda environment to isolate TEGER's dependencies from other projects on the same server. Python 3.9 is recommended for compatibility with all dependencies.</w:t>
       </w:r>
     </w:p>
     <w:p>
@@ -1346,7 +1346,7 @@
           <w:sz w:val="20"/>
           <w:szCs w:val="20"/>
         </w:rPr>
-        <w:t xml:space="preserve">Note: Always activate the environment before running PinaNet. You can verify the active environment with: conda info --envs</w:t>
+        <w:t xml:space="preserve">Note: Always activate the environment before running TEGER. You can verify the active environment with: conda info --envs</w:t>
       </w:r>
     </w:p>
     <w:p>
@@ -1668,7 +1668,7 @@
           <w:sz w:val="18"/>
           <w:szCs w:val="18"/>
         </w:rPr>
-        <w:t xml:space="preserve">PinaNet/</w:t>
+        <w:t xml:space="preserve">TEGER/</w:t>
       </w:r>
     </w:p>
     <w:p>
@@ -1966,7 +1966,7 @@
           <w:sz w:val="22"/>
           <w:szCs w:val="22"/>
         </w:rPr>
-        <w:t xml:space="preserve">A sample FASTA file is included in the test/ directory. Run the following command to confirm PinaNet loads correctly and performs inference:</w:t>
+        <w:t xml:space="preserve">A sample FASTA file is included in the test/ directory. Run the following command to confirm TEGER loads correctly and performs inference:</w:t>
       </w:r>
     </w:p>
     <w:p>
@@ -2490,7 +2490,7 @@
           <w:sz w:val="22"/>
           <w:szCs w:val="22"/>
         </w:rPr>
-        <w:t xml:space="preserve">To completely remove PinaNet and its environment:</w:t>
+        <w:t xml:space="preserve">To completely remove TEGER and its environment:</w:t>
       </w:r>
     </w:p>
     <w:p>
@@ -2544,7 +2544,7 @@
           <w:sz w:val="22"/>
           <w:szCs w:val="22"/>
         </w:rPr>
-        <w:t xml:space="preserve">Delete the repository folder: rm -rf PinaNet/</w:t>
+        <w:t xml:space="preserve">Delete the repository folder: rm -rf TEGER/</w:t>
       </w:r>
     </w:p>
     <w:p>
@@ -2566,7 +2566,7 @@
           <w:sz w:val="18"/>
           <w:szCs w:val="18"/>
         </w:rPr>
-        <w:t xml:space="preserve">PinaNet  |  Developed by Johan S. Piña — Master's in Bioinformatics, 2025</w:t>
+        <w:t xml:space="preserve">TEGER  |  Developed by Johan S. Piña — Master's in Bioinformatics, 2025</w:t>
       </w:r>
     </w:p>
     <w:sectPr>
@@ -2729,7 +2729,7 @@
         <w:sz w:val="18"/>
         <w:szCs w:val="18"/>
       </w:rPr>
-      <w:t xml:space="preserve">PinaNet — Installation Manual</w:t>
+      <w:t xml:space="preserve">TEGER — Installation Manual</w:t>
     </w:r>
     <w:r>
       <w:rPr>

</xml_diff>